<commit_message>
bab 1 fix with citize
</commit_message>
<xml_diff>
--- a/bab 1/BAB I.docx
+++ b/bab 1/BAB I.docx
@@ -74,64 +74,508 @@
     </w:p>
     <w:p>
       <w:pPr>
-        <w:widowControl w:val="0"/>
-        <w:pBdr>
-          <w:top w:val="nil"/>
-          <w:left w:val="nil"/>
-          <w:bottom w:val="nil"/>
-          <w:right w:val="nil"/>
-          <w:between w:val="nil"/>
-        </w:pBdr>
-        <w:spacing w:before="120" w:after="120"/>
         <w:ind w:firstLine="720"/>
-        <w:jc w:val="both"/>
-      </w:pPr>
-      <w:r>
-        <w:t xml:space="preserve">Sebuah penelitian dilakukan karena 3 hal: (1) karena ada masalah yang terlihat atau ditemukan, (2) karena ada pihak yang memesan ke peneliti untuk melakukan kegiatan penelitian tsb, (3) karena ada peluang yang ingin diraih (biasanya untuk meningkatkan citra atau meraih kesempatan/keuntungan lebih). Jika penelitian dilakukan karena point (1), maka sub judul ditulis Latar Belakang Masalah, namun jika penelitian dilakukan karena point (2) dan (3), maka sub judul cukup ditulis dengan Latar Belakang. </w:t>
-      </w:r>
-    </w:p>
-    <w:p>
-      <w:pPr>
-        <w:widowControl w:val="0"/>
-        <w:pBdr>
-          <w:top w:val="nil"/>
-          <w:left w:val="nil"/>
-          <w:bottom w:val="nil"/>
-          <w:right w:val="nil"/>
-          <w:between w:val="nil"/>
-        </w:pBdr>
-        <w:spacing w:before="120" w:after="120"/>
+      </w:pPr>
+      <w:r>
+        <w:rPr>
+          <w:i/>
+          <w:iCs/>
+        </w:rPr>
+        <w:t xml:space="preserve">Fraud </w:t>
+      </w:r>
+      <w:r>
+        <w:t xml:space="preserve">atau </w:t>
+      </w:r>
+      <w:r>
+        <w:rPr>
+          <w:i/>
+          <w:iCs/>
+        </w:rPr>
+        <w:t xml:space="preserve">Penipuan Transaksi </w:t>
+      </w:r>
+      <w:r>
+        <w:t xml:space="preserve">dalam sistem keuangan digital dapat terjadi dalam berbagai bentuk, seperti, transaksi kartu kredit ilegal, manipulasi data transaksi, maupun aktivitas transaksi mencurigakan yang dilakukan oleh pihak tidak bertanggung jawab. </w:t>
+      </w:r>
+      <w:r>
+        <w:rPr>
+          <w:i/>
+          <w:iCs/>
+        </w:rPr>
+        <w:t>Fraud</w:t>
+      </w:r>
+      <w:r>
+        <w:t xml:space="preserve"> tidak hanya menyebabkan kerugian finansial bagi individu dan lembaga keuangan, tetapi juga dapat menurunkan tingkat</w:t>
+      </w:r>
+      <w:r>
+        <w:t xml:space="preserve"> </w:t>
+      </w:r>
+      <w:r>
+        <w:t>kepercayaan masyarakat terhadap sistem pembayaran</w:t>
+      </w:r>
+      <w:r>
+        <w:t xml:space="preserve"> digital</w:t>
+      </w:r>
+    </w:p>
+    <w:p>
+      <w:pPr>
         <w:ind w:firstLine="720"/>
-        <w:jc w:val="both"/>
-      </w:pPr>
-      <w:r>
-        <w:t xml:space="preserve">Latar belakang masalah memuat pernyataan permasalahan yang didapat oleh peneliti, berdasarkan pengamatan langsung atau menyimpulkan dari masukan-masukan yang diterima. Jika perlu memasukkan teori terkait, atau logika-logika penyebab permasalahan, maka cantumkan seperlunya sebagai gambaran umum, tidak perlu detail, karena detail teori atau logika pemecahan masalah, atau solusinya akan dibahas lebih di bab II dan Bab III. </w:t>
-      </w:r>
-    </w:p>
-    <w:p>
-      <w:pPr>
-        <w:widowControl w:val="0"/>
-        <w:pBdr>
-          <w:top w:val="nil"/>
-          <w:left w:val="nil"/>
-          <w:bottom w:val="nil"/>
-          <w:right w:val="nil"/>
-          <w:between w:val="nil"/>
-        </w:pBdr>
-        <w:spacing w:before="120" w:after="120"/>
+        <w:rPr>
+          <w:color w:val="000000"/>
+        </w:rPr>
+      </w:pPr>
+      <w:r>
+        <w:t xml:space="preserve">Dalam konteks industri keuangan modern, </w:t>
+      </w:r>
+      <w:r>
+        <w:rPr>
+          <w:i/>
+          <w:iCs/>
+        </w:rPr>
+        <w:t>deteksi fraud</w:t>
+      </w:r>
+      <w:r>
+        <w:t xml:space="preserve"> menjadi salah satu aspek penting untuk menjaga keamanan sistem keuangan digital. Oleh karena itu, berbagai institusi keuangan telah mengembangkan sistem </w:t>
+      </w:r>
+      <w:r>
+        <w:rPr>
+          <w:i/>
+          <w:iCs/>
+        </w:rPr>
+        <w:t>fraud detection</w:t>
+      </w:r>
+      <w:r>
+        <w:t xml:space="preserve"> yang mampu mengidentifikasi transaksi mencurigakan secara otomatis. Pada awalnya, sistem deteksi fraud banyak menggunakan pendekatan berbasis aturan (rule-based system), yaitu dengan menetapkan aturan tertentu untuk mendeteksi pola transaksi yang tidak wajar. Namun, metode berbasis aturan memiliki keterbatasan karena sulit beradaptasi dengan pola penipuan yang terus berkembang dan semakin kompleks</w:t>
+      </w:r>
+    </w:p>
+    <w:p>
+      <w:pPr>
         <w:ind w:firstLine="720"/>
-        <w:jc w:val="both"/>
-        <w:rPr>
-          <w:color w:val="000000"/>
-        </w:rPr>
-      </w:pPr>
-      <w:r>
-        <w:t xml:space="preserve">Singkatnya “Latar Belakang Masalah” berisi pandangan peneliti terhadap suatu keadaan di suatu tempat atau di suatu objek penelitian. Tuliskan gambaran umum tentang masalah yang peneliti temukan tersebut. Jika peneliti ingin menyampaikan “Latar Belakang”, maka ceritakan hal-hal yang melatarbelakangi peneliti melakukan kegiatan penelitian tersebut, dari mana ide-ide dan gagasan tersebut muncul, apa yang akan dicapai, sehingga kegiatan penelitian tersebut menjadi relevan (sesuai) dengan judul yang diangkat peneliti (penulis). Latar Belakang Masalah atau Latar Belakang tidak lebih dari 4 paragraph, dan sebuah paragraf tidak lebih dari 6 – 7 baris. Dilarang menggunakan kata ganti orang seperti: penulis, saya, mereka, kalian, dia, kami, kita, kamu, anda, dan lain-lain yang sejenis. Dipersilahkan menggunakan kata ganti seperti: peneliti atau penulis. Contoh: Peneliti dalam kegiatan penelitian ini menemukan kondisi yang tidak </w:t>
+      </w:pPr>
+      <w:r>
+        <w:t xml:space="preserve">Seiring perkembangan teknologi data dan kecerdasan buatan, pendekatan </w:t>
+      </w:r>
+      <w:r>
+        <w:rPr>
+          <w:i/>
+          <w:iCs/>
+        </w:rPr>
+        <w:t>machine learning</w:t>
+      </w:r>
+      <w:r>
+        <w:t xml:space="preserve"> mulai banyak digunakan dalam sistem deteksi </w:t>
+      </w:r>
+      <w:r>
+        <w:rPr>
+          <w:i/>
+          <w:iCs/>
+        </w:rPr>
+        <w:t>fraud</w:t>
+      </w:r>
+      <w:r>
+        <w:t xml:space="preserve">. Machine learning memungkinkan sistem untuk mempelajari pola transaksi normal dan transaksi fraud dari data historis, sehingga mampu mendeteksi anomali atau aktivitas mencurigakan secara lebih akurat. Berbagai algoritma machine learning seperti </w:t>
+      </w:r>
+      <w:r>
+        <w:rPr>
+          <w:i/>
+          <w:iCs/>
+        </w:rPr>
+        <w:t>Decision Tree, Random Forest, Support Vector Machine (SVM), dan Neural Network</w:t>
+      </w:r>
+      <w:r>
+        <w:t xml:space="preserve"> telah digunakan dalam penelitian </w:t>
+      </w:r>
+      <w:r>
+        <w:rPr>
+          <w:i/>
+          <w:iCs/>
+        </w:rPr>
+        <w:t>fraud detection</w:t>
+      </w:r>
+      <w:r>
+        <w:t xml:space="preserve"> dan menunjukkan performa yang cukup baik dalam mengidentifikasi transaksi </w:t>
+      </w:r>
+      <w:r>
+        <w:rPr>
+          <w:i/>
+          <w:iCs/>
+        </w:rPr>
+        <w:t>fraud</w:t>
+      </w:r>
+      <w:r>
+        <w:t xml:space="preserve"> . Selain itu, beberapa penelitian juga menunjukkan bahwa algoritma ensemble </w:t>
       </w:r>
       <w:r>
         <w:lastRenderedPageBreak/>
-        <w:t>stabil, sehingga …..</w:t>
-      </w:r>
+        <w:t xml:space="preserve">seperti </w:t>
+      </w:r>
+      <w:r>
+        <w:rPr>
+          <w:i/>
+          <w:iCs/>
+        </w:rPr>
+        <w:t>XGBoost</w:t>
+      </w:r>
+      <w:r>
+        <w:t xml:space="preserve"> mampu mencapai tingkat akurasi yang tinggi dalam mendeteksi transaksi fraud pada sistem keuangan digital</w:t>
+      </w:r>
+      <w:r>
+        <w:t>.</w:t>
+      </w:r>
+      <w:r>
+        <w:t xml:space="preserve"> </w:t>
+      </w:r>
+    </w:p>
+    <w:p>
+      <w:pPr>
+        <w:ind w:firstLine="720"/>
+      </w:pPr>
+      <w:r>
+        <w:t xml:space="preserve">Meskipun berbagai metode </w:t>
+      </w:r>
+      <w:r>
+        <w:rPr>
+          <w:i/>
+          <w:iCs/>
+        </w:rPr>
+        <w:t>klasifikasi</w:t>
+      </w:r>
+      <w:r>
+        <w:t xml:space="preserve"> berbasis </w:t>
+      </w:r>
+      <w:r>
+        <w:rPr>
+          <w:i/>
+          <w:iCs/>
+        </w:rPr>
+        <w:t>machine learning</w:t>
+      </w:r>
+      <w:r>
+        <w:t xml:space="preserve"> mampu mendeteksi transaksi fraud dengan tingkat akurasi yang tinggi, pendekatan </w:t>
+      </w:r>
+      <w:r>
+        <w:rPr>
+          <w:i/>
+          <w:iCs/>
+        </w:rPr>
+        <w:t>klasifikasi</w:t>
+      </w:r>
+      <w:r>
+        <w:t xml:space="preserve"> masih memiliki keterbatasan dalam konteks </w:t>
+      </w:r>
+      <w:r>
+        <w:rPr>
+          <w:i/>
+          <w:iCs/>
+        </w:rPr>
+        <w:t>Operation system</w:t>
+      </w:r>
+      <w:r>
+        <w:t xml:space="preserve"> keuangan digital. Sebagian besar model klasifikasi hanya menghasilkan prediksi berupa dua kelas, yaitu transaksi </w:t>
+      </w:r>
+      <w:r>
+        <w:rPr>
+          <w:i/>
+          <w:iCs/>
+        </w:rPr>
+        <w:t>fraud</w:t>
+      </w:r>
+      <w:r>
+        <w:t xml:space="preserve"> atau </w:t>
+      </w:r>
+      <w:r>
+        <w:rPr>
+          <w:i/>
+          <w:iCs/>
+        </w:rPr>
+        <w:t>non-fraud</w:t>
+      </w:r>
+      <w:r>
+        <w:t xml:space="preserve">. Dalam praktiknya, lembaga keuangan memproses jutaan transaksi setiap hari sehingga tidak memungkinkan untuk meninjau seluruh transaksi yang terdeteksi sebagai </w:t>
+      </w:r>
+      <w:r>
+        <w:rPr>
+          <w:i/>
+          <w:iCs/>
+        </w:rPr>
+        <w:t>fraud</w:t>
+      </w:r>
+      <w:r>
+        <w:t xml:space="preserve"> secara langsung. Oleh karena itu, </w:t>
+      </w:r>
+      <w:r>
+        <w:rPr>
+          <w:i/>
+          <w:iCs/>
+        </w:rPr>
+        <w:t>fraud</w:t>
+      </w:r>
+      <w:r>
+        <w:rPr>
+          <w:i/>
+          <w:iCs/>
+        </w:rPr>
+        <w:t xml:space="preserve"> detection</w:t>
+      </w:r>
+      <w:r>
+        <w:t xml:space="preserve"> </w:t>
+      </w:r>
+      <w:r>
+        <w:rPr>
+          <w:i/>
+          <w:iCs/>
+        </w:rPr>
+        <w:t>system</w:t>
+      </w:r>
+      <w:r>
+        <w:t xml:space="preserve"> </w:t>
+      </w:r>
+      <w:r>
+        <w:t xml:space="preserve">tidak hanya memerlukan kemampuan </w:t>
+      </w:r>
+      <w:r>
+        <w:rPr>
+          <w:i/>
+          <w:iCs/>
+        </w:rPr>
+        <w:t>klasifikasi</w:t>
+      </w:r>
+      <w:r>
+        <w:t xml:space="preserve">, tetapi juga kemampuan untuk </w:t>
+      </w:r>
+      <w:r>
+        <w:rPr>
+          <w:i/>
+          <w:iCs/>
+        </w:rPr>
+        <w:t>memprioritaskan</w:t>
+      </w:r>
+      <w:r>
+        <w:t xml:space="preserve"> transaksi dengan tingkat risiko tertinggi </w:t>
+      </w:r>
+      <w:r>
+        <w:t xml:space="preserve">agar dapat segera ditindaklanjuti oleh tim investigasi. Hal ini menunjukkan bahwa permasalahan deteksi </w:t>
+      </w:r>
+      <w:r>
+        <w:rPr>
+          <w:i/>
+          <w:iCs/>
+        </w:rPr>
+        <w:t>fraud</w:t>
+      </w:r>
+      <w:r>
+        <w:t xml:space="preserve"> tidak hanya dapat dipandang sebagai masalah klasifikasi, tetapi juga sebagai </w:t>
+      </w:r>
+      <w:r>
+        <w:rPr>
+          <w:i/>
+          <w:iCs/>
+        </w:rPr>
+        <w:t>masalah pemeringkatan risiko transaksi</w:t>
+      </w:r>
+      <w:r>
+        <w:t>.</w:t>
+      </w:r>
+    </w:p>
+    <w:p>
+      <w:pPr>
+        <w:ind w:firstLine="720"/>
+      </w:pPr>
+      <w:r>
+        <w:t xml:space="preserve">Salah satu pendekatan machine learning yang dapat digunakan untuk menyelesaikan permasalahan tersebut adalah </w:t>
+      </w:r>
+      <w:r>
+        <w:rPr>
+          <w:i/>
+          <w:iCs/>
+        </w:rPr>
+        <w:t>Learning to Rank (LTR).</w:t>
+      </w:r>
+      <w:r>
+        <w:t xml:space="preserve"> Learning to Rank merupakan metode pembelajaran mesin yang bertujuan untuk memeringkat objek berdasarkan tingkat relevansi atau kepentingannya</w:t>
+      </w:r>
+      <w:r>
+        <w:t>.</w:t>
+      </w:r>
+      <w:r>
+        <w:t xml:space="preserve"> </w:t>
+      </w:r>
+      <w:r>
+        <w:t xml:space="preserve">Metode ini awalnya banyak digunakan dalam bidang </w:t>
+      </w:r>
+      <w:r>
+        <w:rPr>
+          <w:i/>
+          <w:iCs/>
+        </w:rPr>
+        <w:t>information retrieval</w:t>
+      </w:r>
+      <w:r>
+        <w:t>, seperti pada sistem mesin pencari untuk menentukan urutan hasil pencarian yang paling relevan bagi pengguna.</w:t>
+      </w:r>
+    </w:p>
+    <w:p>
+      <w:pPr>
+        <w:ind w:firstLine="720"/>
+        <w:rPr>
+          <w:lang w:val="en-ID"/>
+        </w:rPr>
+      </w:pPr>
+      <w:r>
+        <w:rPr>
+          <w:lang w:val="en-ID"/>
+        </w:rPr>
+        <w:t xml:space="preserve">Dalam konteks deteksi </w:t>
+      </w:r>
+      <w:r>
+        <w:rPr>
+          <w:i/>
+          <w:iCs/>
+          <w:lang w:val="en-ID"/>
+        </w:rPr>
+        <w:t>fraud</w:t>
+      </w:r>
+      <w:r>
+        <w:rPr>
+          <w:lang w:val="en-ID"/>
+        </w:rPr>
+        <w:t xml:space="preserve">, pendekatan </w:t>
+      </w:r>
+      <w:r>
+        <w:rPr>
+          <w:i/>
+          <w:iCs/>
+          <w:lang w:val="en-ID"/>
+        </w:rPr>
+        <w:t>Learning to Rank</w:t>
+      </w:r>
+      <w:r>
+        <w:rPr>
+          <w:lang w:val="en-ID"/>
+        </w:rPr>
+        <w:t xml:space="preserve"> dapat digunakan untuk memeringkat transaksi berdasarkan tingkat </w:t>
+      </w:r>
+      <w:r>
+        <w:rPr>
+          <w:i/>
+          <w:iCs/>
+          <w:lang w:val="en-ID"/>
+        </w:rPr>
+        <w:t>risiko fraud</w:t>
+      </w:r>
+      <w:r>
+        <w:rPr>
+          <w:lang w:val="en-ID"/>
+        </w:rPr>
+        <w:t xml:space="preserve">. Dengan pendekatan ini, sistem tidak hanya mengklasifikasikan transaksi sebagai </w:t>
+      </w:r>
+      <w:r>
+        <w:rPr>
+          <w:i/>
+          <w:iCs/>
+          <w:lang w:val="en-ID"/>
+        </w:rPr>
+        <w:t>fraud</w:t>
+      </w:r>
+      <w:r>
+        <w:rPr>
+          <w:lang w:val="en-ID"/>
+        </w:rPr>
+        <w:t xml:space="preserve"> atau </w:t>
+      </w:r>
+      <w:r>
+        <w:rPr>
+          <w:i/>
+          <w:iCs/>
+          <w:lang w:val="en-ID"/>
+        </w:rPr>
+        <w:t>non-fraud</w:t>
+      </w:r>
+      <w:r>
+        <w:rPr>
+          <w:lang w:val="en-ID"/>
+        </w:rPr>
+        <w:t>, tetapi juga menghasilkan daftar transaksi yang diurutkan berdasarkan tingkat risiko dari yang tertinggi hingga terendah. Pendekatan ini memungkinkan lembaga keuangan untuk memprioritaskan investigasi pada transaksi yang paling berpotensi fraud sehingga proses mitigasi risiko dapat dilakukan secara lebih efektif dan efisien.</w:t>
+      </w:r>
+      <w:r>
+        <w:rPr>
+          <w:lang w:val="en-ID"/>
+        </w:rPr>
+        <w:t xml:space="preserve"> </w:t>
+      </w:r>
+      <w:r>
+        <w:rPr>
+          <w:lang w:val="en-ID"/>
+        </w:rPr>
+        <w:t xml:space="preserve">Beberapa penelitian juga menunjukkan </w:t>
+      </w:r>
+      <w:r>
+        <w:rPr>
+          <w:lang w:val="en-ID"/>
+        </w:rPr>
+        <w:lastRenderedPageBreak/>
+        <w:t>bahwa pendekatan berbasis ranking dapat menjadi alternatif yang lebih efektif dibandingkan metode klasifikasi konvensional dalam pengambilan keputusan berbasis risiko, terutama pada sistem finansial yang kompleks dengan jumlah data transaksi yang sangat besar.</w:t>
+      </w:r>
+    </w:p>
+    <w:p>
+      <w:pPr>
+        <w:ind w:firstLine="720"/>
+        <w:rPr>
+          <w:lang w:val="en-ID"/>
+        </w:rPr>
+      </w:pPr>
+      <w:r>
+        <w:rPr>
+          <w:lang w:val="en-ID"/>
+        </w:rPr>
+        <w:t xml:space="preserve">Berdasarkan permasalahan tersebut, penelitian ini bertujuan untuk mengimplementasikan metode </w:t>
+      </w:r>
+      <w:r>
+        <w:rPr>
+          <w:i/>
+          <w:iCs/>
+          <w:lang w:val="en-ID"/>
+        </w:rPr>
+        <w:t>Learning to Rank</w:t>
+      </w:r>
+      <w:r>
+        <w:rPr>
+          <w:lang w:val="en-ID"/>
+        </w:rPr>
+        <w:t xml:space="preserve"> dalam proses identifikasi risiko transaksi </w:t>
+      </w:r>
+      <w:r>
+        <w:rPr>
+          <w:i/>
+          <w:iCs/>
+          <w:lang w:val="en-ID"/>
+        </w:rPr>
+        <w:t>fraud</w:t>
+      </w:r>
+      <w:r>
+        <w:rPr>
+          <w:lang w:val="en-ID"/>
+        </w:rPr>
+        <w:t xml:space="preserve"> pada sistem keuangan digital. Dengan memanfaatkan pendekatan pemeringkatan, diharapkan sistem dapat mengidentifikasi dan memprioritaskan transaksi dengan tingkat risiko fraud tertinggi secara lebih efektif dibandingkan pendekatan klasifikasi tradisional, sehingga dapat mendukung pengembangan </w:t>
+      </w:r>
+      <w:r>
+        <w:rPr>
+          <w:i/>
+          <w:iCs/>
+          <w:lang w:val="en-ID"/>
+        </w:rPr>
+        <w:t>sistem deteksi fraud yang lebih adaptif dan efisien</w:t>
+      </w:r>
+      <w:r>
+        <w:rPr>
+          <w:lang w:val="en-ID"/>
+        </w:rPr>
+        <w:t>.</w:t>
+      </w:r>
+    </w:p>
+    <w:p>
+      <w:pPr>
+        <w:ind w:firstLine="720"/>
+      </w:pPr>
     </w:p>
     <w:p>
       <w:pPr>
@@ -162,91 +606,6 @@
           <w:szCs w:val="24"/>
         </w:rPr>
         <w:t>Rumusan Masalah</w:t>
-      </w:r>
-    </w:p>
-    <w:p>
-      <w:pPr>
-        <w:widowControl w:val="0"/>
-        <w:pBdr>
-          <w:top w:val="nil"/>
-          <w:left w:val="nil"/>
-          <w:bottom w:val="nil"/>
-          <w:right w:val="nil"/>
-          <w:between w:val="nil"/>
-        </w:pBdr>
-        <w:spacing w:before="120" w:after="120"/>
-        <w:ind w:firstLine="720"/>
-        <w:jc w:val="both"/>
-        <w:rPr>
-          <w:color w:val="000000"/>
-        </w:rPr>
-      </w:pPr>
-      <w:r>
-        <w:rPr>
-          <w:color w:val="000000"/>
-        </w:rPr>
-        <w:t xml:space="preserve">Berdasar </w:t>
-      </w:r>
-      <w:r>
-        <w:t>latar belakang</w:t>
-      </w:r>
-      <w:r>
-        <w:rPr>
-          <w:color w:val="000000"/>
-        </w:rPr>
-        <w:t xml:space="preserve"> masalah seperti di 1.1, tuliskan perumusan masalah dalam bentuk </w:t>
-      </w:r>
-      <w:r>
-        <w:rPr>
-          <w:i/>
-          <w:color w:val="000000"/>
-        </w:rPr>
-        <w:t>list</w:t>
-      </w:r>
-      <w:r>
-        <w:rPr>
-          <w:color w:val="000000"/>
-        </w:rPr>
-        <w:t>. Rumusan masalah harus dapat menyimpulkan masalah-masalah yang ada, dan</w:t>
-      </w:r>
-      <w:r>
-        <w:t xml:space="preserve"> </w:t>
-      </w:r>
-      <w:r>
-        <w:rPr>
-          <w:color w:val="000000"/>
-        </w:rPr>
-        <w:t>dipilih salah satu atau beberapa masalah yang akan diselesaikan dalam penelitian skripsi</w:t>
-      </w:r>
-      <w:r>
-        <w:t xml:space="preserve"> </w:t>
-      </w:r>
-      <w:r>
-        <w:rPr>
-          <w:color w:val="000000"/>
-        </w:rPr>
-        <w:t>ini. Masalah yang akan diajukan hendaknya dirumuskan dalam bentuk kalimat tanya</w:t>
-      </w:r>
-      <w:r>
-        <w:t xml:space="preserve"> </w:t>
-      </w:r>
-      <w:r>
-        <w:rPr>
-          <w:color w:val="000000"/>
-        </w:rPr>
-        <w:t>yang tegas dan jelas, untuk menambah ketajaman masalah. Rumusan masalah harus</w:t>
-      </w:r>
-      <w:r>
-        <w:t xml:space="preserve"> </w:t>
-      </w:r>
-      <w:r>
-        <w:rPr>
-          <w:color w:val="000000"/>
-        </w:rPr>
-        <w:t xml:space="preserve">relevan dengan Latar Belakang Masalah. Jumlah poin dalam rumusan masalah bisa lebih dari 1 namun </w:t>
-      </w:r>
-      <w:r>
-        <w:t>disarankan tidak lebih dari 3.</w:t>
       </w:r>
     </w:p>
     <w:p>
@@ -269,7 +628,13 @@
         <w:rPr>
           <w:color w:val="000000"/>
         </w:rPr>
-        <w:t xml:space="preserve">Contoh: </w:t>
+        <w:t xml:space="preserve">Berdasarkan Latar Belakang yang telah dijelaskan dan diuraikan, </w:t>
+      </w:r>
+      <w:r>
+        <w:rPr>
+          <w:color w:val="000000"/>
+        </w:rPr>
+        <w:t>maka rumusan masalah dalam penelitian ini adalah sebagai berikut:</w:t>
       </w:r>
     </w:p>
     <w:p>
@@ -290,7 +655,17 @@
         <w:jc w:val="both"/>
       </w:pPr>
       <w:r>
-        <w:t>Bagaimana kinerja sensor ultrasonik dan arduino sebagai controller pada sistem keselamatan kendaraan roda dua?</w:t>
+        <w:t xml:space="preserve">Bagaimana Cara Mengimplementasikan metode Learning To Rank untuk identifikasi risiko Transaksi </w:t>
+      </w:r>
+      <w:r>
+        <w:rPr>
+          <w:i/>
+          <w:iCs/>
+        </w:rPr>
+        <w:t xml:space="preserve">Fraud </w:t>
+      </w:r>
+      <w:r>
+        <w:t>pada sistem keuangan digital?</w:t>
       </w:r>
     </w:p>
     <w:p>
@@ -311,7 +686,7 @@
         <w:jc w:val="both"/>
       </w:pPr>
       <w:r>
-        <w:t>Berapa akurasi metode xyz dalam klasifikasi pada kasus X?</w:t>
+        <w:t>Bagaimana proses transformasi data transaksi keuangan menjadi format yang sesuai untuk model Learning to Rank?</w:t>
       </w:r>
     </w:p>
     <w:p>
@@ -332,15 +707,208 @@
         <w:jc w:val="both"/>
       </w:pPr>
       <w:r>
-        <w:t>Seberapa efektif media interaktif berbasis website bagi pembelajaran matematika di SD… ?</w:t>
-      </w:r>
+        <w:rPr>
+          <w:lang w:val="en-ID"/>
+        </w:rPr>
+        <w:t>Bagaimana kinerja model Learning to Rank dalam memprioritaskan transaksi yang berpotensi fraud?</w:t>
+      </w:r>
+    </w:p>
+    <w:p>
+      <w:pPr>
+        <w:widowControl w:val="0"/>
+        <w:pBdr>
+          <w:top w:val="nil"/>
+          <w:left w:val="nil"/>
+          <w:bottom w:val="nil"/>
+          <w:right w:val="nil"/>
+          <w:between w:val="nil"/>
+        </w:pBdr>
+        <w:spacing w:after="0"/>
+        <w:ind w:left="720"/>
+        <w:jc w:val="both"/>
+      </w:pPr>
+    </w:p>
+    <w:p>
+      <w:pPr>
+        <w:widowControl w:val="0"/>
+        <w:pBdr>
+          <w:top w:val="nil"/>
+          <w:left w:val="nil"/>
+          <w:bottom w:val="nil"/>
+          <w:right w:val="nil"/>
+          <w:between w:val="nil"/>
+        </w:pBdr>
+        <w:spacing w:after="0"/>
+        <w:ind w:left="720"/>
+        <w:jc w:val="both"/>
+      </w:pPr>
+    </w:p>
+    <w:p>
+      <w:pPr>
+        <w:widowControl w:val="0"/>
+        <w:pBdr>
+          <w:top w:val="nil"/>
+          <w:left w:val="nil"/>
+          <w:bottom w:val="nil"/>
+          <w:right w:val="nil"/>
+          <w:between w:val="nil"/>
+        </w:pBdr>
+        <w:spacing w:after="0"/>
+        <w:ind w:left="720"/>
+        <w:jc w:val="both"/>
+      </w:pPr>
+    </w:p>
+    <w:p>
+      <w:pPr>
+        <w:widowControl w:val="0"/>
+        <w:pBdr>
+          <w:top w:val="nil"/>
+          <w:left w:val="nil"/>
+          <w:bottom w:val="nil"/>
+          <w:right w:val="nil"/>
+          <w:between w:val="nil"/>
+        </w:pBdr>
+        <w:spacing w:after="0"/>
+        <w:ind w:left="720"/>
+        <w:jc w:val="both"/>
+      </w:pPr>
+    </w:p>
+    <w:p>
+      <w:pPr>
+        <w:widowControl w:val="0"/>
+        <w:pBdr>
+          <w:top w:val="nil"/>
+          <w:left w:val="nil"/>
+          <w:bottom w:val="nil"/>
+          <w:right w:val="nil"/>
+          <w:between w:val="nil"/>
+        </w:pBdr>
+        <w:spacing w:after="0"/>
+        <w:ind w:left="720"/>
+        <w:jc w:val="both"/>
+      </w:pPr>
+    </w:p>
+    <w:p>
+      <w:pPr>
+        <w:widowControl w:val="0"/>
+        <w:pBdr>
+          <w:top w:val="nil"/>
+          <w:left w:val="nil"/>
+          <w:bottom w:val="nil"/>
+          <w:right w:val="nil"/>
+          <w:between w:val="nil"/>
+        </w:pBdr>
+        <w:spacing w:after="0"/>
+        <w:ind w:left="720"/>
+        <w:jc w:val="both"/>
+      </w:pPr>
+    </w:p>
+    <w:p>
+      <w:pPr>
+        <w:widowControl w:val="0"/>
+        <w:pBdr>
+          <w:top w:val="nil"/>
+          <w:left w:val="nil"/>
+          <w:bottom w:val="nil"/>
+          <w:right w:val="nil"/>
+          <w:between w:val="nil"/>
+        </w:pBdr>
+        <w:spacing w:after="0"/>
+        <w:ind w:left="720"/>
+        <w:jc w:val="both"/>
+      </w:pPr>
+    </w:p>
+    <w:p>
+      <w:pPr>
+        <w:widowControl w:val="0"/>
+        <w:pBdr>
+          <w:top w:val="nil"/>
+          <w:left w:val="nil"/>
+          <w:bottom w:val="nil"/>
+          <w:right w:val="nil"/>
+          <w:between w:val="nil"/>
+        </w:pBdr>
+        <w:spacing w:after="0"/>
+        <w:ind w:left="720"/>
+        <w:jc w:val="both"/>
+      </w:pPr>
     </w:p>
     <w:p>
       <w:pPr>
         <w:widowControl w:val="0"/>
         <w:numPr>
           <w:ilvl w:val="0"/>
-          <w:numId w:val="1"/>
+          <w:numId w:val="2"/>
+        </w:numPr>
+        <w:pBdr>
+          <w:top w:val="nil"/>
+          <w:left w:val="nil"/>
+          <w:bottom w:val="nil"/>
+          <w:right w:val="nil"/>
+          <w:between w:val="nil"/>
+        </w:pBdr>
+        <w:spacing w:after="0"/>
+        <w:ind w:hanging="720"/>
+        <w:jc w:val="both"/>
+        <w:rPr>
+          <w:b/>
+          <w:bCs/>
+          <w:color w:val="000000" w:themeColor="text1"/>
+        </w:rPr>
+      </w:pPr>
+      <w:r>
+        <w:rPr>
+          <w:b/>
+          <w:bCs/>
+          <w:color w:val="000000" w:themeColor="text1"/>
+        </w:rPr>
+        <w:lastRenderedPageBreak/>
+        <w:t>Batasan Masalah</w:t>
+      </w:r>
+    </w:p>
+    <w:p>
+      <w:pPr>
+        <w:widowControl w:val="0"/>
+        <w:pBdr>
+          <w:top w:val="nil"/>
+          <w:left w:val="nil"/>
+          <w:bottom w:val="nil"/>
+          <w:right w:val="nil"/>
+          <w:between w:val="nil"/>
+        </w:pBdr>
+        <w:spacing w:after="0"/>
+        <w:ind w:firstLine="720"/>
+        <w:jc w:val="both"/>
+        <w:rPr>
+          <w:color w:val="000000" w:themeColor="text1"/>
+        </w:rPr>
+      </w:pPr>
+      <w:r>
+        <w:rPr>
+          <w:color w:val="000000" w:themeColor="text1"/>
+        </w:rPr>
+        <w:t>Agar penelitian lebih terarah</w:t>
+      </w:r>
+      <w:r>
+        <w:rPr>
+          <w:color w:val="000000" w:themeColor="text1"/>
+        </w:rPr>
+        <w:t xml:space="preserve"> dan fokus serta memastikan hasil yang lebih relevan</w:t>
+      </w:r>
+      <w:r>
+        <w:rPr>
+          <w:color w:val="000000" w:themeColor="text1"/>
+        </w:rPr>
+        <w:t>, maka batasan masalah dalam penelitian ini adalah sebagai berikut:</w:t>
+      </w:r>
+    </w:p>
+    <w:p>
+      <w:pPr>
+        <w:pStyle w:val="ListParagraph"/>
+        <w:widowControl w:val="0"/>
+        <w:numPr>
+          <w:ilvl w:val="0"/>
+          <w:numId w:val="4"/>
         </w:numPr>
         <w:pBdr>
           <w:top w:val="nil"/>
@@ -351,10 +919,194 @@
         </w:pBdr>
         <w:spacing w:after="0"/>
         <w:jc w:val="both"/>
-      </w:pPr>
-      <w:r>
-        <w:t>Seberapa besar pengaruh … ?</w:t>
-      </w:r>
+        <w:rPr>
+          <w:lang w:val="en-ID"/>
+        </w:rPr>
+      </w:pPr>
+      <w:r>
+        <w:t xml:space="preserve">Penelitian ini menggunakan dataset </w:t>
+      </w:r>
+      <w:r>
+        <w:rPr>
+          <w:i/>
+          <w:iCs/>
+        </w:rPr>
+        <w:t>Credit Card Fraud Detection</w:t>
+      </w:r>
+      <w:r>
+        <w:t xml:space="preserve"> yang tersedia secara publik pada platform Kaggle, yang berisi data transaksi kartu kredit dengan label transaksi fraud dan non-fraud.</w:t>
+      </w:r>
+      <w:r>
+        <w:t xml:space="preserve"> </w:t>
+      </w:r>
+      <w:r>
+        <w:t>Dataset ini berisi 284.807 transaksi kartu kredit yang terjadi di Eropa pada bulan September 2013, dengan 492 transaksi dikategorikan sebagai fraud. Dataset ini telah melalui proses anonimisasi menggunakan teknik Principal Component Analysis (PCA) untuk menjaga privasi data pengguna.</w:t>
+      </w:r>
+    </w:p>
+    <w:p>
+      <w:pPr>
+        <w:pStyle w:val="ListParagraph"/>
+        <w:widowControl w:val="0"/>
+        <w:numPr>
+          <w:ilvl w:val="0"/>
+          <w:numId w:val="4"/>
+        </w:numPr>
+        <w:pBdr>
+          <w:top w:val="nil"/>
+          <w:left w:val="nil"/>
+          <w:bottom w:val="nil"/>
+          <w:right w:val="nil"/>
+          <w:between w:val="nil"/>
+        </w:pBdr>
+        <w:spacing w:after="0"/>
+        <w:jc w:val="both"/>
+        <w:rPr>
+          <w:i/>
+          <w:iCs/>
+          <w:lang w:val="en-ID"/>
+        </w:rPr>
+      </w:pPr>
+      <w:r>
+        <w:rPr>
+          <w:lang w:val="en-ID"/>
+        </w:rPr>
+        <w:t>Metode machine learning yang digunakan</w:t>
+      </w:r>
+      <w:r>
+        <w:rPr>
+          <w:lang w:val="en-ID"/>
+        </w:rPr>
+        <w:t xml:space="preserve"> </w:t>
+      </w:r>
+      <w:r>
+        <w:rPr>
+          <w:lang w:val="en-ID"/>
+        </w:rPr>
+        <w:t xml:space="preserve">pada pendekatan </w:t>
+      </w:r>
+      <w:r>
+        <w:rPr>
+          <w:i/>
+          <w:iCs/>
+          <w:lang w:val="en-ID"/>
+        </w:rPr>
+        <w:t>Learning to Rank.</w:t>
+      </w:r>
+    </w:p>
+    <w:p>
+      <w:pPr>
+        <w:pStyle w:val="ListParagraph"/>
+        <w:widowControl w:val="0"/>
+        <w:numPr>
+          <w:ilvl w:val="0"/>
+          <w:numId w:val="4"/>
+        </w:numPr>
+        <w:pBdr>
+          <w:top w:val="nil"/>
+          <w:left w:val="nil"/>
+          <w:bottom w:val="nil"/>
+          <w:right w:val="nil"/>
+          <w:between w:val="nil"/>
+        </w:pBdr>
+        <w:spacing w:after="0"/>
+        <w:jc w:val="both"/>
+        <w:rPr>
+          <w:lang w:val="en-ID"/>
+        </w:rPr>
+      </w:pPr>
+      <w:r>
+        <w:rPr>
+          <w:lang w:val="en-ID"/>
+        </w:rPr>
+        <w:t xml:space="preserve">Model yang digunakan bertujuan untuk memeringkat transaksi berdasarkan tingkat risiko </w:t>
+      </w:r>
+      <w:r>
+        <w:rPr>
+          <w:i/>
+          <w:iCs/>
+          <w:lang w:val="en-ID"/>
+        </w:rPr>
+        <w:t>fraud</w:t>
+      </w:r>
+      <w:r>
+        <w:rPr>
+          <w:lang w:val="en-ID"/>
+        </w:rPr>
+        <w:t>.</w:t>
+      </w:r>
+    </w:p>
+    <w:p>
+      <w:pPr>
+        <w:pStyle w:val="ListParagraph"/>
+        <w:widowControl w:val="0"/>
+        <w:numPr>
+          <w:ilvl w:val="0"/>
+          <w:numId w:val="4"/>
+        </w:numPr>
+        <w:pBdr>
+          <w:top w:val="nil"/>
+          <w:left w:val="nil"/>
+          <w:bottom w:val="nil"/>
+          <w:right w:val="nil"/>
+          <w:between w:val="nil"/>
+        </w:pBdr>
+        <w:spacing w:after="0"/>
+        <w:jc w:val="both"/>
+        <w:rPr>
+          <w:lang w:val="en-ID"/>
+        </w:rPr>
+      </w:pPr>
+      <w:r>
+        <w:rPr>
+          <w:lang w:val="en-ID"/>
+        </w:rPr>
+        <w:t>Evaluasi model dilakukan menggunakan metrik evaluasi yang umum digunakan dalam model ranking.</w:t>
+      </w:r>
+    </w:p>
+    <w:p>
+      <w:pPr>
+        <w:pStyle w:val="ListParagraph"/>
+        <w:widowControl w:val="0"/>
+        <w:numPr>
+          <w:ilvl w:val="0"/>
+          <w:numId w:val="4"/>
+        </w:numPr>
+        <w:pBdr>
+          <w:top w:val="nil"/>
+          <w:left w:val="nil"/>
+          <w:bottom w:val="nil"/>
+          <w:right w:val="nil"/>
+          <w:between w:val="nil"/>
+        </w:pBdr>
+        <w:spacing w:after="0"/>
+        <w:jc w:val="both"/>
+        <w:rPr>
+          <w:lang w:val="en-ID"/>
+        </w:rPr>
+      </w:pPr>
+      <w:r>
+        <w:rPr>
+          <w:lang w:val="en-ID"/>
+        </w:rPr>
+        <w:t>Penelitian ini tidak membahas implementasi sistem deteksi fraud secara langsung pada sistem keuangan operasional.</w:t>
+      </w:r>
+    </w:p>
+    <w:p>
+      <w:pPr>
+        <w:widowControl w:val="0"/>
+        <w:pBdr>
+          <w:top w:val="nil"/>
+          <w:left w:val="nil"/>
+          <w:bottom w:val="nil"/>
+          <w:right w:val="nil"/>
+          <w:between w:val="nil"/>
+        </w:pBdr>
+        <w:spacing w:after="0"/>
+        <w:jc w:val="both"/>
+        <w:rPr>
+          <w:color w:val="000000" w:themeColor="text1"/>
+        </w:rPr>
+      </w:pPr>
     </w:p>
     <w:p>
       <w:pPr>
@@ -373,8 +1125,6 @@
           <w:szCs w:val="24"/>
         </w:rPr>
       </w:pPr>
-      <w:bookmarkStart w:id="2" w:name="_heading=h.23ckvvd" w:colFirst="0" w:colLast="0"/>
-      <w:bookmarkEnd w:id="2"/>
       <w:r>
         <w:rPr>
           <w:rFonts w:ascii="Times New Roman" w:hAnsi="Times New Roman" w:cs="Times New Roman"/>
@@ -384,7 +1134,7 @@
           <w:sz w:val="24"/>
           <w:szCs w:val="24"/>
         </w:rPr>
-        <w:t>Batasan Masalah</w:t>
+        <w:t>Tujuan Penelitian</w:t>
       </w:r>
     </w:p>
     <w:p>
@@ -398,47 +1148,23 @@
           <w:between w:val="nil"/>
         </w:pBdr>
         <w:spacing w:before="120" w:after="120"/>
-        <w:ind w:firstLine="720"/>
+        <w:ind w:firstLine="360"/>
         <w:jc w:val="both"/>
       </w:pPr>
       <w:r>
-        <w:t>Tuliskan batasan masalah penelitian yang dilakukan. Batasan masalah menerangkan tentang berbagai hal yang disengaja tidak dimasukkan ke dalam penelitian, karena diperkirakan tidak berpengaruh pada hasil penelitian secara signifikan. Selain itu, Batasan masalah berisi tentang variabel yang akan diteliti dan variabel yang diasumsikan sebagai parameter konstanta atau parameter yang diabaikan. Contoh batasan penelitian antara lain: lokasi, metode, data, asumsi. Batasan masalah dapat dituliskan ke dalam bentuk list.</w:t>
-      </w:r>
-    </w:p>
-    <w:p>
-      <w:pPr>
-        <w:pStyle w:val="Heading2"/>
+        <w:t>Tujuan yang akan dicapai oleh peneliti dalam penelitiannya adalah menghasilkan</w:t>
+      </w:r>
+      <w:r>
+        <w:t xml:space="preserve"> :</w:t>
+      </w:r>
+    </w:p>
+    <w:p>
+      <w:pPr>
+        <w:widowControl w:val="0"/>
         <w:numPr>
           <w:ilvl w:val="0"/>
-          <w:numId w:val="2"/>
+          <w:numId w:val="5"/>
         </w:numPr>
-        <w:ind w:hanging="720"/>
-        <w:rPr>
-          <w:rFonts w:ascii="Times New Roman" w:hAnsi="Times New Roman" w:cs="Times New Roman"/>
-          <w:b/>
-          <w:bCs/>
-          <w:color w:val="000000" w:themeColor="text1"/>
-          <w:sz w:val="24"/>
-          <w:szCs w:val="24"/>
-        </w:rPr>
-      </w:pPr>
-      <w:bookmarkStart w:id="3" w:name="_heading=h.ihv636" w:colFirst="0" w:colLast="0"/>
-      <w:bookmarkEnd w:id="3"/>
-      <w:r>
-        <w:rPr>
-          <w:rFonts w:ascii="Times New Roman" w:hAnsi="Times New Roman" w:cs="Times New Roman"/>
-          <w:b/>
-          <w:bCs/>
-          <w:color w:val="000000" w:themeColor="text1"/>
-          <w:sz w:val="24"/>
-          <w:szCs w:val="24"/>
-        </w:rPr>
-        <w:t>Tujuan Penelitian</w:t>
-      </w:r>
-    </w:p>
-    <w:p>
-      <w:pPr>
-        <w:widowControl w:val="0"/>
         <w:pBdr>
           <w:top w:val="nil"/>
           <w:left w:val="nil"/>
@@ -447,20 +1173,39 @@
           <w:between w:val="nil"/>
         </w:pBdr>
         <w:spacing w:before="120" w:after="120"/>
-        <w:ind w:firstLine="720"/>
         <w:jc w:val="both"/>
-      </w:pPr>
-      <w:r>
-        <w:t xml:space="preserve">Tujuan penelitian berisi tentang upaya penyelesaian masalah (mengetahui, memahami, menganalisis, menghitung, memvalidasi parameter-parameter penelitian yang relevan dengan topik penelitian) yang dapat diukur </w:t>
-      </w:r>
-      <w:r>
-        <w:lastRenderedPageBreak/>
-        <w:t>ketercapaiannya. Tujuan ini harus sinkron dengan metode, analisis, dan kesimpulan dan harus terjawab di dalam kesimpulan dan intisari/abstrak. Contoh:</w:t>
+        <w:rPr>
+          <w:lang w:val="en-ID"/>
+        </w:rPr>
+      </w:pPr>
+      <w:r>
+        <w:rPr>
+          <w:lang w:val="en-ID"/>
+        </w:rPr>
+        <w:t xml:space="preserve">Mengimplementasikan metode </w:t>
+      </w:r>
+      <w:r>
+        <w:rPr>
+          <w:i/>
+          <w:iCs/>
+          <w:lang w:val="en-ID"/>
+        </w:rPr>
+        <w:t>Learning to Rank</w:t>
+      </w:r>
+      <w:r>
+        <w:rPr>
+          <w:lang w:val="en-ID"/>
+        </w:rPr>
+        <w:t xml:space="preserve"> dalam proses identifikasi risiko transaksi fraud pada sistem keuangan digital.</w:t>
       </w:r>
     </w:p>
     <w:p>
       <w:pPr>
         <w:widowControl w:val="0"/>
+        <w:numPr>
+          <w:ilvl w:val="0"/>
+          <w:numId w:val="5"/>
+        </w:numPr>
         <w:pBdr>
           <w:top w:val="nil"/>
           <w:left w:val="nil"/>
@@ -469,47 +1214,39 @@
           <w:between w:val="nil"/>
         </w:pBdr>
         <w:spacing w:before="120" w:after="120"/>
-        <w:ind w:firstLine="720"/>
         <w:jc w:val="both"/>
-      </w:pPr>
-      <w:r>
-        <w:t>Tujuan yang akan dicapai oleh peneliti dalam penelitiannya adalah menghasilkan …</w:t>
-      </w:r>
-    </w:p>
-    <w:p>
-      <w:pPr>
-        <w:pStyle w:val="Heading2"/>
+        <w:rPr>
+          <w:lang w:val="en-ID"/>
+        </w:rPr>
+      </w:pPr>
+      <w:r>
+        <w:rPr>
+          <w:lang w:val="en-ID"/>
+        </w:rPr>
+        <w:t xml:space="preserve">Mengembangkan model pemeringkatan transaksi berdasarkan tingkat risiko </w:t>
+      </w:r>
+      <w:r>
+        <w:rPr>
+          <w:i/>
+          <w:iCs/>
+          <w:lang w:val="en-ID"/>
+        </w:rPr>
+        <w:t>fraud</w:t>
+      </w:r>
+      <w:r>
+        <w:rPr>
+          <w:lang w:val="en-ID"/>
+        </w:rPr>
+        <w:t xml:space="preserve"> menggunakan teknik machine learning.</w:t>
+      </w:r>
+    </w:p>
+    <w:p>
+      <w:pPr>
+        <w:widowControl w:val="0"/>
         <w:numPr>
           <w:ilvl w:val="0"/>
-          <w:numId w:val="2"/>
+          <w:numId w:val="5"/>
         </w:numPr>
-        <w:ind w:hanging="720"/>
-        <w:rPr>
-          <w:rFonts w:ascii="Times New Roman" w:hAnsi="Times New Roman" w:cs="Times New Roman"/>
-          <w:b/>
-          <w:bCs/>
-          <w:color w:val="000000" w:themeColor="text1"/>
-          <w:sz w:val="24"/>
-          <w:szCs w:val="24"/>
-        </w:rPr>
-      </w:pPr>
-      <w:bookmarkStart w:id="4" w:name="_heading=h.32hioqz" w:colFirst="0" w:colLast="0"/>
-      <w:bookmarkEnd w:id="4"/>
-      <w:r>
-        <w:rPr>
-          <w:rFonts w:ascii="Times New Roman" w:hAnsi="Times New Roman" w:cs="Times New Roman"/>
-          <w:b/>
-          <w:bCs/>
-          <w:color w:val="000000" w:themeColor="text1"/>
-          <w:sz w:val="24"/>
-          <w:szCs w:val="24"/>
-        </w:rPr>
-        <w:t>Manfaat Penelitian</w:t>
-      </w:r>
-    </w:p>
-    <w:p>
-      <w:pPr>
-        <w:widowControl w:val="0"/>
         <w:pBdr>
           <w:top w:val="nil"/>
           <w:left w:val="nil"/>
@@ -518,57 +1255,16 @@
           <w:between w:val="nil"/>
         </w:pBdr>
         <w:spacing w:before="120" w:after="120"/>
-        <w:ind w:firstLine="720"/>
         <w:jc w:val="both"/>
-      </w:pPr>
-      <w:r>
-        <w:rPr>
-          <w:color w:val="000000"/>
-        </w:rPr>
-        <w:t xml:space="preserve">Tuliskan manfaat penelitian Anda, baik secara teknis maupun </w:t>
-      </w:r>
-      <w:r>
-        <w:t>non teknis</w:t>
-      </w:r>
-      <w:r>
-        <w:rPr>
-          <w:color w:val="000000"/>
-        </w:rPr>
-        <w:t>. Manfaat penelitian berfokus pada hasil yang bisa dimanfaatkan oleh objek, pengguna atau organisasi ketika aplikasi ini jadi. Manfaat penelitian tidak berfokus pada diri peneliti. Contoh penu</w:t>
-      </w:r>
-      <w:r>
-        <w:t>lisan manfaat penelitian dapat dijabarkan menjadi 2 yaitu berdasarkan segi teoritis dan praktis atau manfaat bagi objek penelitian dan bagi peneliti selanjutnya.</w:t>
-      </w:r>
-    </w:p>
-    <w:p>
-      <w:pPr>
-        <w:pStyle w:val="Heading2"/>
-        <w:numPr>
-          <w:ilvl w:val="0"/>
-          <w:numId w:val="2"/>
-        </w:numPr>
-        <w:ind w:hanging="720"/>
-        <w:rPr>
-          <w:rFonts w:ascii="Times New Roman" w:hAnsi="Times New Roman" w:cs="Times New Roman"/>
-          <w:b/>
-          <w:bCs/>
-          <w:color w:val="000000" w:themeColor="text1"/>
-          <w:sz w:val="24"/>
-          <w:szCs w:val="24"/>
-        </w:rPr>
-      </w:pPr>
-      <w:bookmarkStart w:id="5" w:name="_heading=h.1hmsyys" w:colFirst="0" w:colLast="0"/>
-      <w:bookmarkEnd w:id="5"/>
-      <w:r>
-        <w:rPr>
-          <w:rFonts w:ascii="Times New Roman" w:hAnsi="Times New Roman" w:cs="Times New Roman"/>
-          <w:b/>
-          <w:bCs/>
-          <w:color w:val="000000" w:themeColor="text1"/>
-          <w:sz w:val="24"/>
-          <w:szCs w:val="24"/>
-        </w:rPr>
-        <w:t>Sistematika Penulisan</w:t>
+        <w:rPr>
+          <w:lang w:val="en-ID"/>
+        </w:rPr>
+      </w:pPr>
+      <w:r>
+        <w:rPr>
+          <w:lang w:val="en-ID"/>
+        </w:rPr>
+        <w:t>Mengevaluasi performa model Learning to Rank dalam memprioritaskan transaksi yang berpotensi fraud.</w:t>
       </w:r>
     </w:p>
     <w:p>
@@ -583,16 +1279,10 @@
         </w:pBdr>
         <w:spacing w:before="120" w:after="120"/>
         <w:jc w:val="both"/>
-      </w:pPr>
-      <w:r>
-        <w:rPr>
-          <w:b/>
-        </w:rPr>
-        <w:tab/>
-      </w:r>
-      <w:r>
-        <w:t>Berisi sistematika penulisan skripsi yang memuat uraian secara garis besar isi skripsi untuk tiap-tiap bab. Peneliti harus dapat mendeskripsikan (menggambarkan) apa saja isi masing-masing Bab yang akan disusun. Jelaskan secara singkat isi dari bab I, bab II, bab III, bab IV, dan bab V.</w:t>
-      </w:r>
+        <w:rPr>
+          <w:lang w:val="en-ID"/>
+        </w:rPr>
+      </w:pPr>
     </w:p>
     <w:p>
       <w:pPr>
@@ -606,10 +1296,10 @@
         </w:pBdr>
         <w:spacing w:before="120" w:after="120"/>
         <w:jc w:val="both"/>
-      </w:pPr>
-      <w:r>
-        <w:t>Contoh :</w:t>
-      </w:r>
+        <w:rPr>
+          <w:lang w:val="en-ID"/>
+        </w:rPr>
+      </w:pPr>
     </w:p>
     <w:p>
       <w:pPr>
@@ -623,10 +1313,10 @@
         </w:pBdr>
         <w:spacing w:before="120" w:after="120"/>
         <w:jc w:val="both"/>
-      </w:pPr>
-      <w:r>
-        <w:t>BAB I PENDAHULUAN, berisi Latar belakang masalah, rumusan masalah, …</w:t>
-      </w:r>
+        <w:rPr>
+          <w:lang w:val="en-ID"/>
+        </w:rPr>
+      </w:pPr>
     </w:p>
     <w:p>
       <w:pPr>
@@ -640,9 +1330,168 @@
         </w:pBdr>
         <w:spacing w:before="120" w:after="120"/>
         <w:jc w:val="both"/>
-      </w:pPr>
-      <w:r>
-        <w:t>BAB II TINJAUAN PUSTAKA, berisi tinjauan pustaka, dasar-dasar teori yang digunakan, …</w:t>
+        <w:rPr>
+          <w:lang w:val="en-ID"/>
+        </w:rPr>
+      </w:pPr>
+    </w:p>
+    <w:p>
+      <w:pPr>
+        <w:pStyle w:val="Heading2"/>
+        <w:numPr>
+          <w:ilvl w:val="0"/>
+          <w:numId w:val="2"/>
+        </w:numPr>
+        <w:ind w:hanging="720"/>
+        <w:rPr>
+          <w:rFonts w:ascii="Times New Roman" w:hAnsi="Times New Roman" w:cs="Times New Roman"/>
+          <w:b/>
+          <w:bCs/>
+          <w:color w:val="000000" w:themeColor="text1"/>
+          <w:sz w:val="24"/>
+          <w:szCs w:val="24"/>
+        </w:rPr>
+      </w:pPr>
+      <w:bookmarkStart w:id="2" w:name="_heading=h.32hioqz" w:colFirst="0" w:colLast="0"/>
+      <w:bookmarkEnd w:id="2"/>
+      <w:r>
+        <w:rPr>
+          <w:rFonts w:ascii="Times New Roman" w:hAnsi="Times New Roman" w:cs="Times New Roman"/>
+          <w:b/>
+          <w:bCs/>
+          <w:color w:val="000000" w:themeColor="text1"/>
+          <w:sz w:val="24"/>
+          <w:szCs w:val="24"/>
+        </w:rPr>
+        <w:t>Manfaat Penelitian</w:t>
+      </w:r>
+    </w:p>
+    <w:p>
+      <w:pPr>
+        <w:ind w:firstLine="720"/>
+      </w:pPr>
+      <w:r>
+        <w:t>Penelitian ini di harapkan dapat memberikan manfaat baik dari segi teoritis maupun praktis, yang dapat dijelaskan sebagai berikut :</w:t>
+      </w:r>
+    </w:p>
+    <w:p>
+      <w:pPr>
+        <w:ind w:firstLine="720"/>
+        <w:rPr>
+          <w:b/>
+          <w:bCs/>
+          <w:lang w:val="en-ID"/>
+        </w:rPr>
+      </w:pPr>
+      <w:r>
+        <w:rPr>
+          <w:b/>
+          <w:bCs/>
+          <w:lang w:val="en-ID"/>
+        </w:rPr>
+        <w:t>1. Manfaat Teoritis</w:t>
+      </w:r>
+    </w:p>
+    <w:p>
+      <w:pPr>
+        <w:ind w:left="720" w:firstLine="720"/>
+        <w:rPr>
+          <w:lang w:val="en-ID"/>
+        </w:rPr>
+      </w:pPr>
+      <w:r>
+        <w:rPr>
+          <w:lang w:val="en-ID"/>
+        </w:rPr>
+        <w:t xml:space="preserve">Penelitian ini diharapkan dapat memberikan kontribusi dalam pengembangan kajian ilmiah di bidang </w:t>
+      </w:r>
+      <w:r>
+        <w:rPr>
+          <w:i/>
+          <w:iCs/>
+          <w:lang w:val="en-ID"/>
+        </w:rPr>
+        <w:t>machine learning dan financial technology</w:t>
+      </w:r>
+      <w:r>
+        <w:rPr>
+          <w:i/>
+          <w:iCs/>
+          <w:lang w:val="en-ID"/>
+        </w:rPr>
+        <w:t xml:space="preserve"> (fintech)</w:t>
+      </w:r>
+      <w:r>
+        <w:rPr>
+          <w:lang w:val="en-ID"/>
+        </w:rPr>
+        <w:t>, khususnya terkait penerapan metode Learning to Rank dalam deteksi risiko transaksi fraud.</w:t>
+      </w:r>
+    </w:p>
+    <w:p>
+      <w:pPr>
+        <w:ind w:firstLine="720"/>
+        <w:rPr>
+          <w:b/>
+          <w:bCs/>
+          <w:lang w:val="en-ID"/>
+        </w:rPr>
+      </w:pPr>
+      <w:r>
+        <w:rPr>
+          <w:b/>
+          <w:bCs/>
+          <w:lang w:val="en-ID"/>
+        </w:rPr>
+        <w:t>2. Manfaat Praktis</w:t>
+      </w:r>
+    </w:p>
+    <w:p>
+      <w:pPr>
+        <w:ind w:left="720" w:firstLine="720"/>
+        <w:rPr>
+          <w:lang w:val="en-ID"/>
+        </w:rPr>
+      </w:pPr>
+      <w:r>
+        <w:rPr>
+          <w:lang w:val="en-ID"/>
+        </w:rPr>
+        <w:t>Penelitian ini diharapkan dapat menjadi referensi bagi lembaga keuangan atau perusahaan fintech dalam mengembangkan sistem deteksi fraud yang lebih efektif dengan memanfaatkan pendekatan pemeringkatan risiko transaksi.</w:t>
+      </w:r>
+    </w:p>
+    <w:p>
+      <w:pPr>
+        <w:ind w:firstLine="720"/>
+      </w:pPr>
+    </w:p>
+    <w:p>
+      <w:pPr>
+        <w:pStyle w:val="Heading2"/>
+        <w:numPr>
+          <w:ilvl w:val="0"/>
+          <w:numId w:val="2"/>
+        </w:numPr>
+        <w:ind w:hanging="720"/>
+        <w:rPr>
+          <w:rFonts w:ascii="Times New Roman" w:hAnsi="Times New Roman" w:cs="Times New Roman"/>
+          <w:b/>
+          <w:bCs/>
+          <w:color w:val="000000" w:themeColor="text1"/>
+          <w:sz w:val="24"/>
+          <w:szCs w:val="24"/>
+        </w:rPr>
+      </w:pPr>
+      <w:r>
+        <w:rPr>
+          <w:rFonts w:ascii="Times New Roman" w:hAnsi="Times New Roman" w:cs="Times New Roman"/>
+          <w:b/>
+          <w:bCs/>
+          <w:color w:val="000000" w:themeColor="text1"/>
+          <w:sz w:val="24"/>
+          <w:szCs w:val="24"/>
+        </w:rPr>
+        <w:t>Sistematika Penulisan</w:t>
       </w:r>
     </w:p>
     <w:p>
@@ -658,9 +1507,84 @@
         <w:spacing w:before="120" w:after="120"/>
         <w:jc w:val="both"/>
       </w:pPr>
-      <w:bookmarkStart w:id="6" w:name="_heading=h.3dy6vkm" w:colFirst="0" w:colLast="0"/>
-      <w:bookmarkEnd w:id="6"/>
-      <w:r>
+      <w:r>
+        <w:rPr>
+          <w:b/>
+        </w:rPr>
+        <w:tab/>
+      </w:r>
+      <w:r>
+        <w:t>Berisi sistematika penulisan skripsi yang memuat uraian secara garis besar isi skripsi untuk tiap-tiap bab. Peneliti harus dapat mendeskripsikan (menggambarkan) apa saja isi masing-masing Bab yang akan disusun. Jelaskan secara singkat isi dari bab I, bab II, bab III, bab IV, dan bab V.</w:t>
+      </w:r>
+    </w:p>
+    <w:p>
+      <w:pPr>
+        <w:widowControl w:val="0"/>
+        <w:pBdr>
+          <w:top w:val="nil"/>
+          <w:left w:val="nil"/>
+          <w:bottom w:val="nil"/>
+          <w:right w:val="nil"/>
+          <w:between w:val="nil"/>
+        </w:pBdr>
+        <w:spacing w:before="120" w:after="120"/>
+        <w:jc w:val="both"/>
+      </w:pPr>
+      <w:r>
+        <w:t>Contoh :</w:t>
+      </w:r>
+    </w:p>
+    <w:p>
+      <w:pPr>
+        <w:widowControl w:val="0"/>
+        <w:pBdr>
+          <w:top w:val="nil"/>
+          <w:left w:val="nil"/>
+          <w:bottom w:val="nil"/>
+          <w:right w:val="nil"/>
+          <w:between w:val="nil"/>
+        </w:pBdr>
+        <w:spacing w:before="120" w:after="120"/>
+        <w:jc w:val="both"/>
+      </w:pPr>
+      <w:r>
+        <w:t>BAB I PENDAHULUAN, berisi Latar belakang masalah, rumusan masalah, …</w:t>
+      </w:r>
+    </w:p>
+    <w:p>
+      <w:pPr>
+        <w:widowControl w:val="0"/>
+        <w:pBdr>
+          <w:top w:val="nil"/>
+          <w:left w:val="nil"/>
+          <w:bottom w:val="nil"/>
+          <w:right w:val="nil"/>
+          <w:between w:val="nil"/>
+        </w:pBdr>
+        <w:spacing w:before="120" w:after="120"/>
+        <w:jc w:val="both"/>
+      </w:pPr>
+      <w:r>
+        <w:t>BAB II TINJAUAN PUSTAKA, berisi tinjauan pustaka, dasar-dasar teori yang digunakan, …</w:t>
+      </w:r>
+    </w:p>
+    <w:p>
+      <w:pPr>
+        <w:widowControl w:val="0"/>
+        <w:pBdr>
+          <w:top w:val="nil"/>
+          <w:left w:val="nil"/>
+          <w:bottom w:val="nil"/>
+          <w:right w:val="nil"/>
+          <w:between w:val="nil"/>
+        </w:pBdr>
+        <w:spacing w:before="120" w:after="120"/>
+        <w:jc w:val="both"/>
+      </w:pPr>
+      <w:bookmarkStart w:id="3" w:name="_heading=h.3dy6vkm" w:colFirst="0" w:colLast="0"/>
+      <w:bookmarkEnd w:id="3"/>
+      <w:r>
+        <w:lastRenderedPageBreak/>
         <w:t>BAB III METODE PENELITIAN, didalamnya terdapat tinjauan umum tentang objek penelitian, analisis masalah, solusi yang ditawarkan, rancangan, …</w:t>
       </w:r>
     </w:p>
@@ -785,6 +1709,119 @@
     </w:lvl>
   </w:abstractNum>
   <w:abstractNum w:abstractNumId="1" w15:restartNumberingAfterBreak="0">
+    <w:nsid w:val="25987AEB"/>
+    <w:multiLevelType w:val="multilevel"/>
+    <w:tmpl w:val="99BA0F9E"/>
+    <w:lvl w:ilvl="0">
+      <w:start w:val="1"/>
+      <w:numFmt w:val="decimal"/>
+      <w:lvlText w:val="%1."/>
+      <w:lvlJc w:val="left"/>
+      <w:pPr>
+        <w:tabs>
+          <w:tab w:val="num" w:pos="720"/>
+        </w:tabs>
+        <w:ind w:left="720" w:hanging="360"/>
+      </w:pPr>
+    </w:lvl>
+    <w:lvl w:ilvl="1" w:tentative="1">
+      <w:start w:val="1"/>
+      <w:numFmt w:val="decimal"/>
+      <w:lvlText w:val="%2."/>
+      <w:lvlJc w:val="left"/>
+      <w:pPr>
+        <w:tabs>
+          <w:tab w:val="num" w:pos="1440"/>
+        </w:tabs>
+        <w:ind w:left="1440" w:hanging="360"/>
+      </w:pPr>
+    </w:lvl>
+    <w:lvl w:ilvl="2" w:tentative="1">
+      <w:start w:val="1"/>
+      <w:numFmt w:val="decimal"/>
+      <w:lvlText w:val="%3."/>
+      <w:lvlJc w:val="left"/>
+      <w:pPr>
+        <w:tabs>
+          <w:tab w:val="num" w:pos="2160"/>
+        </w:tabs>
+        <w:ind w:left="2160" w:hanging="360"/>
+      </w:pPr>
+    </w:lvl>
+    <w:lvl w:ilvl="3" w:tentative="1">
+      <w:start w:val="1"/>
+      <w:numFmt w:val="decimal"/>
+      <w:lvlText w:val="%4."/>
+      <w:lvlJc w:val="left"/>
+      <w:pPr>
+        <w:tabs>
+          <w:tab w:val="num" w:pos="2880"/>
+        </w:tabs>
+        <w:ind w:left="2880" w:hanging="360"/>
+      </w:pPr>
+    </w:lvl>
+    <w:lvl w:ilvl="4" w:tentative="1">
+      <w:start w:val="1"/>
+      <w:numFmt w:val="decimal"/>
+      <w:lvlText w:val="%5."/>
+      <w:lvlJc w:val="left"/>
+      <w:pPr>
+        <w:tabs>
+          <w:tab w:val="num" w:pos="3600"/>
+        </w:tabs>
+        <w:ind w:left="3600" w:hanging="360"/>
+      </w:pPr>
+    </w:lvl>
+    <w:lvl w:ilvl="5" w:tentative="1">
+      <w:start w:val="1"/>
+      <w:numFmt w:val="decimal"/>
+      <w:lvlText w:val="%6."/>
+      <w:lvlJc w:val="left"/>
+      <w:pPr>
+        <w:tabs>
+          <w:tab w:val="num" w:pos="4320"/>
+        </w:tabs>
+        <w:ind w:left="4320" w:hanging="360"/>
+      </w:pPr>
+    </w:lvl>
+    <w:lvl w:ilvl="6" w:tentative="1">
+      <w:start w:val="1"/>
+      <w:numFmt w:val="decimal"/>
+      <w:lvlText w:val="%7."/>
+      <w:lvlJc w:val="left"/>
+      <w:pPr>
+        <w:tabs>
+          <w:tab w:val="num" w:pos="5040"/>
+        </w:tabs>
+        <w:ind w:left="5040" w:hanging="360"/>
+      </w:pPr>
+    </w:lvl>
+    <w:lvl w:ilvl="7" w:tentative="1">
+      <w:start w:val="1"/>
+      <w:numFmt w:val="decimal"/>
+      <w:lvlText w:val="%8."/>
+      <w:lvlJc w:val="left"/>
+      <w:pPr>
+        <w:tabs>
+          <w:tab w:val="num" w:pos="5760"/>
+        </w:tabs>
+        <w:ind w:left="5760" w:hanging="360"/>
+      </w:pPr>
+    </w:lvl>
+    <w:lvl w:ilvl="8" w:tentative="1">
+      <w:start w:val="1"/>
+      <w:numFmt w:val="decimal"/>
+      <w:lvlText w:val="%9."/>
+      <w:lvlJc w:val="left"/>
+      <w:pPr>
+        <w:tabs>
+          <w:tab w:val="num" w:pos="6480"/>
+        </w:tabs>
+        <w:ind w:left="6480" w:hanging="360"/>
+      </w:pPr>
+    </w:lvl>
+  </w:abstractNum>
+  <w:abstractNum w:abstractNumId="2" w15:restartNumberingAfterBreak="0">
     <w:nsid w:val="363974AE"/>
     <w:multiLevelType w:val="multilevel"/>
     <w:tmpl w:val="0E842FEA"/>
@@ -897,11 +1934,219 @@
       </w:rPr>
     </w:lvl>
   </w:abstractNum>
+  <w:abstractNum w:abstractNumId="3" w15:restartNumberingAfterBreak="0">
+    <w:nsid w:val="39DE2996"/>
+    <w:multiLevelType w:val="multilevel"/>
+    <w:tmpl w:val="87401CB8"/>
+    <w:lvl w:ilvl="0">
+      <w:start w:val="1"/>
+      <w:numFmt w:val="decimal"/>
+      <w:lvlText w:val="%1."/>
+      <w:lvlJc w:val="left"/>
+      <w:pPr>
+        <w:ind w:left="720" w:hanging="360"/>
+      </w:pPr>
+    </w:lvl>
+    <w:lvl w:ilvl="1">
+      <w:start w:val="1"/>
+      <w:numFmt w:val="lowerLetter"/>
+      <w:lvlText w:val="%2."/>
+      <w:lvlJc w:val="left"/>
+      <w:pPr>
+        <w:ind w:left="1440" w:hanging="360"/>
+      </w:pPr>
+    </w:lvl>
+    <w:lvl w:ilvl="2">
+      <w:start w:val="1"/>
+      <w:numFmt w:val="lowerRoman"/>
+      <w:lvlText w:val="%3."/>
+      <w:lvlJc w:val="right"/>
+      <w:pPr>
+        <w:ind w:left="2160" w:hanging="180"/>
+      </w:pPr>
+    </w:lvl>
+    <w:lvl w:ilvl="3">
+      <w:start w:val="1"/>
+      <w:numFmt w:val="decimal"/>
+      <w:lvlText w:val="%4."/>
+      <w:lvlJc w:val="left"/>
+      <w:pPr>
+        <w:ind w:left="2880" w:hanging="360"/>
+      </w:pPr>
+    </w:lvl>
+    <w:lvl w:ilvl="4">
+      <w:start w:val="1"/>
+      <w:numFmt w:val="lowerLetter"/>
+      <w:lvlText w:val="%5."/>
+      <w:lvlJc w:val="left"/>
+      <w:pPr>
+        <w:ind w:left="3600" w:hanging="360"/>
+      </w:pPr>
+    </w:lvl>
+    <w:lvl w:ilvl="5">
+      <w:start w:val="1"/>
+      <w:numFmt w:val="lowerRoman"/>
+      <w:lvlText w:val="%6."/>
+      <w:lvlJc w:val="right"/>
+      <w:pPr>
+        <w:ind w:left="4320" w:hanging="180"/>
+      </w:pPr>
+    </w:lvl>
+    <w:lvl w:ilvl="6">
+      <w:start w:val="1"/>
+      <w:numFmt w:val="decimal"/>
+      <w:lvlText w:val="%7."/>
+      <w:lvlJc w:val="left"/>
+      <w:pPr>
+        <w:ind w:left="5040" w:hanging="360"/>
+      </w:pPr>
+    </w:lvl>
+    <w:lvl w:ilvl="7">
+      <w:start w:val="1"/>
+      <w:numFmt w:val="lowerLetter"/>
+      <w:lvlText w:val="%8."/>
+      <w:lvlJc w:val="left"/>
+      <w:pPr>
+        <w:ind w:left="5760" w:hanging="360"/>
+      </w:pPr>
+    </w:lvl>
+    <w:lvl w:ilvl="8">
+      <w:start w:val="1"/>
+      <w:numFmt w:val="lowerRoman"/>
+      <w:lvlText w:val="%9."/>
+      <w:lvlJc w:val="right"/>
+      <w:pPr>
+        <w:ind w:left="6480" w:hanging="180"/>
+      </w:pPr>
+    </w:lvl>
+  </w:abstractNum>
+  <w:abstractNum w:abstractNumId="4" w15:restartNumberingAfterBreak="0">
+    <w:nsid w:val="7F314352"/>
+    <w:multiLevelType w:val="multilevel"/>
+    <w:tmpl w:val="C6A42ADA"/>
+    <w:lvl w:ilvl="0">
+      <w:start w:val="1"/>
+      <w:numFmt w:val="decimal"/>
+      <w:lvlText w:val="%1."/>
+      <w:lvlJc w:val="left"/>
+      <w:pPr>
+        <w:tabs>
+          <w:tab w:val="num" w:pos="720"/>
+        </w:tabs>
+        <w:ind w:left="720" w:hanging="360"/>
+      </w:pPr>
+    </w:lvl>
+    <w:lvl w:ilvl="1" w:tentative="1">
+      <w:start w:val="1"/>
+      <w:numFmt w:val="decimal"/>
+      <w:lvlText w:val="%2."/>
+      <w:lvlJc w:val="left"/>
+      <w:pPr>
+        <w:tabs>
+          <w:tab w:val="num" w:pos="1440"/>
+        </w:tabs>
+        <w:ind w:left="1440" w:hanging="360"/>
+      </w:pPr>
+    </w:lvl>
+    <w:lvl w:ilvl="2" w:tentative="1">
+      <w:start w:val="1"/>
+      <w:numFmt w:val="decimal"/>
+      <w:lvlText w:val="%3."/>
+      <w:lvlJc w:val="left"/>
+      <w:pPr>
+        <w:tabs>
+          <w:tab w:val="num" w:pos="2160"/>
+        </w:tabs>
+        <w:ind w:left="2160" w:hanging="360"/>
+      </w:pPr>
+    </w:lvl>
+    <w:lvl w:ilvl="3" w:tentative="1">
+      <w:start w:val="1"/>
+      <w:numFmt w:val="decimal"/>
+      <w:lvlText w:val="%4."/>
+      <w:lvlJc w:val="left"/>
+      <w:pPr>
+        <w:tabs>
+          <w:tab w:val="num" w:pos="2880"/>
+        </w:tabs>
+        <w:ind w:left="2880" w:hanging="360"/>
+      </w:pPr>
+    </w:lvl>
+    <w:lvl w:ilvl="4" w:tentative="1">
+      <w:start w:val="1"/>
+      <w:numFmt w:val="decimal"/>
+      <w:lvlText w:val="%5."/>
+      <w:lvlJc w:val="left"/>
+      <w:pPr>
+        <w:tabs>
+          <w:tab w:val="num" w:pos="3600"/>
+        </w:tabs>
+        <w:ind w:left="3600" w:hanging="360"/>
+      </w:pPr>
+    </w:lvl>
+    <w:lvl w:ilvl="5" w:tentative="1">
+      <w:start w:val="1"/>
+      <w:numFmt w:val="decimal"/>
+      <w:lvlText w:val="%6."/>
+      <w:lvlJc w:val="left"/>
+      <w:pPr>
+        <w:tabs>
+          <w:tab w:val="num" w:pos="4320"/>
+        </w:tabs>
+        <w:ind w:left="4320" w:hanging="360"/>
+      </w:pPr>
+    </w:lvl>
+    <w:lvl w:ilvl="6" w:tentative="1">
+      <w:start w:val="1"/>
+      <w:numFmt w:val="decimal"/>
+      <w:lvlText w:val="%7."/>
+      <w:lvlJc w:val="left"/>
+      <w:pPr>
+        <w:tabs>
+          <w:tab w:val="num" w:pos="5040"/>
+        </w:tabs>
+        <w:ind w:left="5040" w:hanging="360"/>
+      </w:pPr>
+    </w:lvl>
+    <w:lvl w:ilvl="7" w:tentative="1">
+      <w:start w:val="1"/>
+      <w:numFmt w:val="decimal"/>
+      <w:lvlText w:val="%8."/>
+      <w:lvlJc w:val="left"/>
+      <w:pPr>
+        <w:tabs>
+          <w:tab w:val="num" w:pos="5760"/>
+        </w:tabs>
+        <w:ind w:left="5760" w:hanging="360"/>
+      </w:pPr>
+    </w:lvl>
+    <w:lvl w:ilvl="8" w:tentative="1">
+      <w:start w:val="1"/>
+      <w:numFmt w:val="decimal"/>
+      <w:lvlText w:val="%9."/>
+      <w:lvlJc w:val="left"/>
+      <w:pPr>
+        <w:tabs>
+          <w:tab w:val="num" w:pos="6480"/>
+        </w:tabs>
+        <w:ind w:left="6480" w:hanging="360"/>
+      </w:pPr>
+    </w:lvl>
+  </w:abstractNum>
   <w:num w:numId="1" w16cid:durableId="74400133">
-    <w:abstractNumId w:val="1"/>
+    <w:abstractNumId w:val="2"/>
   </w:num>
   <w:num w:numId="2" w16cid:durableId="968239235">
     <w:abstractNumId w:val="0"/>
+  </w:num>
+  <w:num w:numId="3" w16cid:durableId="1119954525">
+    <w:abstractNumId w:val="1"/>
+  </w:num>
+  <w:num w:numId="4" w16cid:durableId="604389224">
+    <w:abstractNumId w:val="3"/>
+  </w:num>
+  <w:num w:numId="5" w16cid:durableId="1027952871">
+    <w:abstractNumId w:val="4"/>
   </w:num>
 </w:numbering>
 </file>
@@ -1831,6 +3076,24 @@
       <w:spacing w:val="5"/>
     </w:rPr>
   </w:style>
+  <w:style w:type="character" w:styleId="PlaceholderText">
+    <w:name w:val="Placeholder Text"/>
+    <w:basedOn w:val="DefaultParagraphFont"/>
+    <w:uiPriority w:val="99"/>
+    <w:semiHidden/>
+    <w:rsid w:val="006C7333"/>
+    <w:rPr>
+      <w:color w:val="666666"/>
+    </w:rPr>
+  </w:style>
+  <w:style w:type="paragraph" w:styleId="NormalWeb">
+    <w:name w:val="Normal (Web)"/>
+    <w:basedOn w:val="Normal"/>
+    <w:uiPriority w:val="99"/>
+    <w:semiHidden/>
+    <w:unhideWhenUsed/>
+    <w:rsid w:val="00F91D17"/>
+  </w:style>
 </w:styles>
 </file>
 
@@ -2129,6 +3392,31 @@
 </a:theme>
 </file>
 
+<file path=word/webextensions/taskpanes.xml><?xml version="1.0" encoding="utf-8"?>
+<wetp:taskpanes xmlns:wetp="http://schemas.microsoft.com/office/webextensions/taskpanes/2010/11">
+  <wetp:taskpane dockstate="right" visibility="0" width="438" row="1">
+    <wetp:webextensionref xmlns:r="http://schemas.openxmlformats.org/officeDocument/2006/relationships" r:id="rId1"/>
+  </wetp:taskpane>
+</wetp:taskpanes>
+</file>
+
+<file path=word/webextensions/webextension1.xml><?xml version="1.0" encoding="utf-8"?>
+<we:webextension xmlns:we="http://schemas.microsoft.com/office/webextensions/webextension/2010/11" id="{98F33022-92E5-42B7-8B56-078CC36F7ADF}">
+  <we:reference id="wa104382081" version="1.55.1.0" store="en-US" storeType="OMEX"/>
+  <we:alternateReferences>
+    <we:reference id="WA104382081" version="1.55.1.0" store="" storeType="OMEX"/>
+  </we:alternateReferences>
+  <we:properties>
+    <we:property name="MENDELEY_BIBLIOGRAPHY_IS_DIRTY" value="true"/>
+    <we:property name="MENDELEY_BIBLIOGRAPHY_LAST_MODIFIED" value="1772953053074"/>
+    <we:property name="MENDELEY_CITATIONS" value="[]"/>
+    <we:property name="MENDELEY_CITATIONS_STYLE" value="{&quot;id&quot;:&quot;http://www.zotero.org/styles/ieee&quot;,&quot;title&quot;:&quot;IEEE Reference Guide version 11.29.2023&quot;,&quot;format&quot;:&quot;numeric&quot;,&quot;defaultLocale&quot;:null,&quot;isLocaleCodeValid&quot;:true}"/>
+  </we:properties>
+  <we:bindings/>
+  <we:snapshot xmlns:r="http://schemas.openxmlformats.org/officeDocument/2006/relationships"/>
+</we:webextension>
+</file>
+
 <file path=customXml/item1.xml><?xml version="1.0" encoding="utf-8"?>
 <b:Sources xmlns:b="http://schemas.openxmlformats.org/officeDocument/2006/bibliography" xmlns="http://schemas.openxmlformats.org/officeDocument/2006/bibliography" SelectedStyle="\APASixthEditionOfficeOnline.xsl" StyleName="APA" Version="6"/>
 </file>

</xml_diff>